<commit_message>
HVM, SZI jgyk letöltés javítás
</commit_message>
<xml_diff>
--- a/BiztvillCRM.Web/wwwroot/sablonok/VBF_Szig_vizsg.docx
+++ b/BiztvillCRM.Web/wwwroot/sablonok/VBF_Szig_vizsg.docx
@@ -72,7 +72,7 @@
                 <w:sz w:val="22"/>
                 <w:szCs w:val="20"/>
               </w:rPr>
-              <w:t>Vágó Ádám e.v.</w:t>
+              <w:t>Biztovill kft</w:t>
             </w:r>
           </w:p>
         </w:tc>
@@ -118,59 +118,17 @@
             </w:r>
             <w:r>
               <w:rPr>
-                <w:rFonts w:ascii="Cambria" w:hAnsi="Cambria" w:cs="Tahoma"/>
-                <w:sz w:val="22"/>
-              </w:rPr>
-              <w:t>V</w:t>
-            </w:r>
-            <w:r>
-              <w:rPr>
-                <w:rFonts w:ascii="Cambria" w:hAnsi="Cambria" w:cs="Tahoma"/>
-                <w:sz w:val="22"/>
-              </w:rPr>
-              <w:t>A</w:t>
-            </w:r>
-            <w:r>
-              <w:rPr>
-                <w:rFonts w:ascii="Cambria" w:hAnsi="Cambria" w:cs="Tahoma"/>
-                <w:sz w:val="22"/>
-              </w:rPr>
-              <w:t>-</w:t>
-            </w:r>
-            <w:r>
-              <w:rPr>
-                <w:rFonts w:ascii="Cambria" w:hAnsi="Cambria" w:cs="Tahoma"/>
-                <w:sz w:val="22"/>
-              </w:rPr>
-              <w:t>AC</w:t>
-            </w:r>
-            <w:r>
-              <w:rPr>
-                <w:rFonts w:ascii="Cambria" w:hAnsi="Cambria" w:cs="Tahoma"/>
-                <w:sz w:val="22"/>
-              </w:rPr>
-              <w:t>-</w:t>
-            </w:r>
-            <w:r>
-              <w:rPr>
-                <w:rFonts w:ascii="Cambria" w:hAnsi="Cambria" w:cs="Tahoma"/>
-                <w:sz w:val="22"/>
-              </w:rPr>
-              <w:t>MK</w:t>
-            </w:r>
-            <w:r>
-              <w:rPr>
-                <w:rFonts w:ascii="Cambria" w:hAnsi="Cambria" w:cs="Tahoma"/>
-                <w:sz w:val="22"/>
-              </w:rPr>
-              <w:t>-2505</w:t>
-            </w:r>
-            <w:r>
-              <w:rPr>
-                <w:rFonts w:ascii="Cambria" w:hAnsi="Cambria" w:cs="Tahoma"/>
-                <w:sz w:val="22"/>
-              </w:rPr>
-              <w:t>20</w:t>
+                <w:rFonts w:ascii="Segoe UI" w:hAnsi="Segoe UI" w:cs="Segoe UI"/>
+                <w:sz w:val="20"/>
+              </w:rPr>
+              <w:t>VBF-000255/2026/M1/</w:t>
+            </w:r>
+            <w:r>
+              <w:rPr>
+                <w:rFonts w:ascii="Segoe UI" w:hAnsi="Segoe UI" w:cs="Segoe UI"/>
+                <w:sz w:val="20"/>
+              </w:rPr>
+              <w:t>SZI</w:t>
             </w:r>
           </w:p>
         </w:tc>
@@ -403,7 +361,39 @@
                 <w:sz w:val="20"/>
                 <w:szCs w:val="20"/>
               </w:rPr>
-              <w:t>H-6000 Kecskemét Barényi Béla út Mercedes gyár Batmon terület. 2025.05.20.</w:t>
+              <w:t>H-</w:t>
+            </w:r>
+            <w:r>
+              <w:rPr>
+                <w:rFonts w:ascii="Segoe UI" w:hAnsi="Segoe UI" w:cs="Segoe UI"/>
+                <w:sz w:val="20"/>
+                <w:szCs w:val="20"/>
+              </w:rPr>
+              <w:t>2040 Budaörs, Vasút utca 3. 2026</w:t>
+            </w:r>
+            <w:r>
+              <w:rPr>
+                <w:rFonts w:ascii="Segoe UI" w:hAnsi="Segoe UI" w:cs="Segoe UI"/>
+                <w:sz w:val="20"/>
+                <w:szCs w:val="20"/>
+              </w:rPr>
+              <w:t>.05.2</w:t>
+            </w:r>
+            <w:r>
+              <w:rPr>
+                <w:rFonts w:ascii="Segoe UI" w:hAnsi="Segoe UI" w:cs="Segoe UI"/>
+                <w:sz w:val="20"/>
+                <w:szCs w:val="20"/>
+              </w:rPr>
+              <w:t>4</w:t>
+            </w:r>
+            <w:r>
+              <w:rPr>
+                <w:rFonts w:ascii="Segoe UI" w:hAnsi="Segoe UI" w:cs="Segoe UI"/>
+                <w:sz w:val="20"/>
+                <w:szCs w:val="20"/>
+              </w:rPr>
+              <w:t>.</w:t>
             </w:r>
           </w:p>
         </w:tc>
@@ -1755,7 +1745,15 @@
                 <w:sz w:val="16"/>
                 <w:szCs w:val="16"/>
               </w:rPr>
-              <w:t>0,150</w:t>
+              <w:t>0,</w:t>
+            </w:r>
+            <w:r>
+              <w:rPr>
+                <w:rFonts w:ascii="Segoe UI" w:hAnsi="Segoe UI" w:cs="Segoe UI"/>
+                <w:sz w:val="16"/>
+                <w:szCs w:val="16"/>
+              </w:rPr>
+              <w:t>04</w:t>
             </w:r>
           </w:p>
         </w:tc>
@@ -1842,7 +1840,7 @@
                 <w:sz w:val="16"/>
                 <w:szCs w:val="16"/>
               </w:rPr>
-              <w:t>15</w:t>
+              <w:t>23</w:t>
             </w:r>
             <w:r>
               <w:rPr>
@@ -2108,7 +2106,15 @@
                 <w:sz w:val="16"/>
                 <w:szCs w:val="16"/>
               </w:rPr>
-              <w:t>TE/1</w:t>
+              <w:t>W</w:t>
+            </w:r>
+            <w:r>
+              <w:rPr>
+                <w:rFonts w:ascii="Segoe UI" w:hAnsi="Segoe UI" w:cs="Segoe UI"/>
+                <w:sz w:val="16"/>
+                <w:szCs w:val="16"/>
+              </w:rPr>
+              <w:t>1</w:t>
             </w:r>
           </w:p>
         </w:tc>
@@ -2142,7 +2148,7 @@
                 <w:sz w:val="16"/>
                 <w:szCs w:val="16"/>
               </w:rPr>
-              <w:t>328.5</w:t>
+              <w:t>109.5</w:t>
             </w:r>
           </w:p>
         </w:tc>
@@ -2281,7 +2287,7 @@
                 <w:sz w:val="16"/>
                 <w:szCs w:val="16"/>
               </w:rPr>
-              <w:t>TE/1</w:t>
+              <w:t>W2</w:t>
             </w:r>
           </w:p>
         </w:tc>
@@ -2314,7 +2320,7 @@
                 <w:sz w:val="16"/>
                 <w:szCs w:val="16"/>
               </w:rPr>
-              <w:t>381</w:t>
+              <w:t>127</w:t>
             </w:r>
           </w:p>
         </w:tc>
@@ -2453,7 +2459,7 @@
                 <w:sz w:val="16"/>
                 <w:szCs w:val="16"/>
               </w:rPr>
-              <w:t>TE/1</w:t>
+              <w:t>W6</w:t>
             </w:r>
           </w:p>
         </w:tc>
@@ -2487,7 +2493,7 @@
                 <w:sz w:val="16"/>
                 <w:szCs w:val="16"/>
               </w:rPr>
-              <w:t>330</w:t>
+              <w:t>1100</w:t>
             </w:r>
           </w:p>
         </w:tc>
@@ -2625,7 +2631,7 @@
                 <w:sz w:val="16"/>
                 <w:szCs w:val="16"/>
               </w:rPr>
-              <w:t>TE/1</w:t>
+              <w:t>W7</w:t>
             </w:r>
           </w:p>
         </w:tc>
@@ -2659,7 +2665,7 @@
                 <w:sz w:val="16"/>
                 <w:szCs w:val="16"/>
               </w:rPr>
-              <w:t>348</w:t>
+              <w:t>116</w:t>
             </w:r>
           </w:p>
         </w:tc>
@@ -2797,7 +2803,7 @@
                 <w:sz w:val="16"/>
                 <w:szCs w:val="16"/>
               </w:rPr>
-              <w:t>TE/1</w:t>
+              <w:t>W8</w:t>
             </w:r>
           </w:p>
         </w:tc>
@@ -2831,7 +2837,7 @@
                 <w:sz w:val="16"/>
                 <w:szCs w:val="16"/>
               </w:rPr>
-              <w:t>376.5</w:t>
+              <w:t>125.5</w:t>
             </w:r>
           </w:p>
         </w:tc>
@@ -2937,7 +2943,7 @@
       </w:tr>
       <w:tr>
         <w:trPr>
-          <w:trHeight w:val="850"/>
+          <w:trHeight w:val="283"/>
           <w:jc w:val="center"/>
         </w:trPr>
         <w:tc>
@@ -2945,6 +2951,1220 @@
             <w:tcW w:w="3116" w:type="dxa"/>
             <w:gridSpan w:val="4"/>
             <w:tcBorders>
+              <w:top w:val="single" w:sz="4" w:space="0" w:color="auto"/>
+              <w:bottom w:val="single" w:sz="4" w:space="0" w:color="auto"/>
+              <w:right w:val="single" w:sz="8" w:space="0" w:color="auto"/>
+            </w:tcBorders>
+            <w:shd w:val="clear" w:color="auto" w:fill="auto"/>
+            <w:noWrap/>
+            <w:vAlign w:val="center"/>
+          </w:tcPr>
+          <w:p>
+            <w:pPr>
+              <w:spacing w:line="276" w:lineRule="auto"/>
+              <w:ind w:left="770"/>
+              <w:rPr>
+                <w:rFonts w:ascii="Segoe UI" w:hAnsi="Segoe UI" w:cs="Segoe UI"/>
+                <w:sz w:val="16"/>
+                <w:szCs w:val="16"/>
+              </w:rPr>
+            </w:pPr>
+            <w:r>
+              <w:rPr>
+                <w:rFonts w:ascii="Segoe UI" w:hAnsi="Segoe UI" w:cs="Segoe UI"/>
+                <w:sz w:val="16"/>
+                <w:szCs w:val="16"/>
+              </w:rPr>
+              <w:t>W18</w:t>
+            </w:r>
+          </w:p>
+        </w:tc>
+        <w:tc>
+          <w:tcPr>
+            <w:tcW w:w="1561" w:type="dxa"/>
+            <w:gridSpan w:val="2"/>
+            <w:tcBorders>
+              <w:top w:val="single" w:sz="4" w:space="0" w:color="auto"/>
+              <w:left w:val="single" w:sz="8" w:space="0" w:color="auto"/>
+              <w:bottom w:val="single" w:sz="4" w:space="0" w:color="auto"/>
+              <w:right w:val="single" w:sz="8" w:space="0" w:color="auto"/>
+            </w:tcBorders>
+            <w:shd w:val="clear" w:color="auto" w:fill="auto"/>
+            <w:noWrap/>
+            <w:vAlign w:val="center"/>
+          </w:tcPr>
+          <w:p>
+            <w:pPr>
+              <w:spacing w:line="276" w:lineRule="auto"/>
+              <w:jc w:val="center"/>
+              <w:rPr>
+                <w:rFonts w:ascii="Segoe UI" w:hAnsi="Segoe UI" w:cs="Segoe UI"/>
+                <w:sz w:val="16"/>
+                <w:szCs w:val="16"/>
+              </w:rPr>
+            </w:pPr>
+            <w:r>
+              <w:rPr>
+                <w:rFonts w:ascii="Segoe UI" w:hAnsi="Segoe UI" w:cs="Segoe UI"/>
+                <w:sz w:val="16"/>
+                <w:szCs w:val="16"/>
+              </w:rPr>
+              <w:t>110</w:t>
+            </w:r>
+          </w:p>
+        </w:tc>
+        <w:tc>
+          <w:tcPr>
+            <w:tcW w:w="1704" w:type="dxa"/>
+            <w:gridSpan w:val="3"/>
+            <w:tcBorders>
+              <w:top w:val="single" w:sz="4" w:space="0" w:color="auto"/>
+              <w:left w:val="single" w:sz="8" w:space="0" w:color="auto"/>
+              <w:bottom w:val="single" w:sz="4" w:space="0" w:color="auto"/>
+              <w:right w:val="single" w:sz="8" w:space="0" w:color="auto"/>
+            </w:tcBorders>
+            <w:shd w:val="clear" w:color="auto" w:fill="auto"/>
+            <w:noWrap/>
+            <w:vAlign w:val="center"/>
+          </w:tcPr>
+          <w:p>
+            <w:pPr>
+              <w:spacing w:line="276" w:lineRule="auto"/>
+              <w:jc w:val="center"/>
+              <w:rPr>
+                <w:rFonts w:ascii="Segoe UI" w:hAnsi="Segoe UI" w:cs="Segoe UI"/>
+                <w:sz w:val="16"/>
+                <w:szCs w:val="16"/>
+              </w:rPr>
+            </w:pPr>
+            <w:r>
+              <w:rPr>
+                <w:rFonts w:ascii="Segoe UI" w:hAnsi="Segoe UI" w:cs="Segoe UI"/>
+                <w:sz w:val="16"/>
+                <w:szCs w:val="16"/>
+              </w:rPr>
+              <w:t>2200</w:t>
+            </w:r>
+          </w:p>
+        </w:tc>
+        <w:tc>
+          <w:tcPr>
+            <w:tcW w:w="1555" w:type="dxa"/>
+            <w:gridSpan w:val="2"/>
+            <w:tcBorders>
+              <w:top w:val="single" w:sz="4" w:space="0" w:color="auto"/>
+              <w:left w:val="single" w:sz="8" w:space="0" w:color="auto"/>
+              <w:bottom w:val="single" w:sz="4" w:space="0" w:color="auto"/>
+              <w:right w:val="single" w:sz="8" w:space="0" w:color="auto"/>
+            </w:tcBorders>
+            <w:shd w:val="clear" w:color="auto" w:fill="auto"/>
+            <w:vAlign w:val="center"/>
+          </w:tcPr>
+          <w:p>
+            <w:pPr>
+              <w:spacing w:line="276" w:lineRule="auto"/>
+              <w:jc w:val="center"/>
+              <w:rPr>
+                <w:rFonts w:ascii="Segoe UI" w:hAnsi="Segoe UI" w:cs="Segoe UI"/>
+                <w:sz w:val="16"/>
+                <w:szCs w:val="16"/>
+              </w:rPr>
+            </w:pPr>
+            <w:r>
+              <w:rPr>
+                <w:rFonts w:ascii="Segoe UI" w:hAnsi="Segoe UI" w:cs="Segoe UI"/>
+                <w:sz w:val="16"/>
+                <w:szCs w:val="16"/>
+              </w:rPr>
+              <w:t>4.2</w:t>
+            </w:r>
+          </w:p>
+        </w:tc>
+        <w:tc>
+          <w:tcPr>
+            <w:tcW w:w="1845" w:type="dxa"/>
+            <w:tcBorders>
+              <w:top w:val="single" w:sz="4" w:space="0" w:color="auto"/>
+              <w:left w:val="single" w:sz="8" w:space="0" w:color="auto"/>
+              <w:bottom w:val="single" w:sz="4" w:space="0" w:color="auto"/>
+            </w:tcBorders>
+            <w:shd w:val="clear" w:color="auto" w:fill="auto"/>
+            <w:noWrap/>
+            <w:vAlign w:val="center"/>
+          </w:tcPr>
+          <w:p>
+            <w:pPr>
+              <w:spacing w:line="276" w:lineRule="auto"/>
+              <w:jc w:val="center"/>
+              <w:rPr>
+                <w:rFonts w:ascii="Segoe UI" w:hAnsi="Segoe UI" w:cs="Segoe UI"/>
+                <w:sz w:val="16"/>
+                <w:szCs w:val="16"/>
+              </w:rPr>
+            </w:pPr>
+            <w:r>
+              <w:rPr>
+                <w:rFonts w:ascii="Segoe UI" w:hAnsi="Segoe UI" w:cs="Segoe UI"/>
+                <w:sz w:val="16"/>
+                <w:szCs w:val="16"/>
+              </w:rPr>
+              <w:t>MEGFELELŐ</w:t>
+            </w:r>
+          </w:p>
+        </w:tc>
+      </w:tr>
+      <w:tr>
+        <w:trPr>
+          <w:trHeight w:val="283"/>
+          <w:jc w:val="center"/>
+        </w:trPr>
+        <w:tc>
+          <w:tcPr>
+            <w:tcW w:w="3116" w:type="dxa"/>
+            <w:gridSpan w:val="4"/>
+            <w:tcBorders>
+              <w:top w:val="single" w:sz="4" w:space="0" w:color="auto"/>
+              <w:bottom w:val="single" w:sz="4" w:space="0" w:color="auto"/>
+              <w:right w:val="single" w:sz="8" w:space="0" w:color="auto"/>
+            </w:tcBorders>
+            <w:shd w:val="clear" w:color="auto" w:fill="auto"/>
+            <w:noWrap/>
+            <w:vAlign w:val="center"/>
+          </w:tcPr>
+          <w:p>
+            <w:pPr>
+              <w:spacing w:line="276" w:lineRule="auto"/>
+              <w:ind w:left="770"/>
+              <w:rPr>
+                <w:rFonts w:ascii="Segoe UI" w:hAnsi="Segoe UI" w:cs="Segoe UI"/>
+                <w:sz w:val="16"/>
+                <w:szCs w:val="16"/>
+              </w:rPr>
+            </w:pPr>
+            <w:r>
+              <w:rPr>
+                <w:rFonts w:ascii="Segoe UI" w:hAnsi="Segoe UI" w:cs="Segoe UI"/>
+                <w:sz w:val="16"/>
+                <w:szCs w:val="16"/>
+              </w:rPr>
+              <w:t>W19</w:t>
+            </w:r>
+          </w:p>
+        </w:tc>
+        <w:tc>
+          <w:tcPr>
+            <w:tcW w:w="1561" w:type="dxa"/>
+            <w:gridSpan w:val="2"/>
+            <w:tcBorders>
+              <w:top w:val="single" w:sz="4" w:space="0" w:color="auto"/>
+              <w:left w:val="single" w:sz="8" w:space="0" w:color="auto"/>
+              <w:bottom w:val="single" w:sz="4" w:space="0" w:color="auto"/>
+              <w:right w:val="single" w:sz="8" w:space="0" w:color="auto"/>
+            </w:tcBorders>
+            <w:shd w:val="clear" w:color="auto" w:fill="auto"/>
+            <w:noWrap/>
+            <w:vAlign w:val="center"/>
+          </w:tcPr>
+          <w:p>
+            <w:pPr>
+              <w:spacing w:line="276" w:lineRule="auto"/>
+              <w:jc w:val="center"/>
+              <w:rPr>
+                <w:rFonts w:ascii="Segoe UI" w:hAnsi="Segoe UI" w:cs="Segoe UI"/>
+                <w:sz w:val="16"/>
+                <w:szCs w:val="16"/>
+              </w:rPr>
+            </w:pPr>
+            <w:r>
+              <w:rPr>
+                <w:rFonts w:ascii="Segoe UI" w:hAnsi="Segoe UI" w:cs="Segoe UI"/>
+                <w:sz w:val="16"/>
+                <w:szCs w:val="16"/>
+              </w:rPr>
+              <w:t>109.</w:t>
+            </w:r>
+            <w:bookmarkStart w:id="1" w:name="_GoBack"/>
+            <w:bookmarkEnd w:id="1"/>
+            <w:r>
+              <w:rPr>
+                <w:rFonts w:ascii="Segoe UI" w:hAnsi="Segoe UI" w:cs="Segoe UI"/>
+                <w:sz w:val="16"/>
+                <w:szCs w:val="16"/>
+              </w:rPr>
+              <w:t>9</w:t>
+            </w:r>
+          </w:p>
+        </w:tc>
+        <w:tc>
+          <w:tcPr>
+            <w:tcW w:w="1704" w:type="dxa"/>
+            <w:gridSpan w:val="3"/>
+            <w:tcBorders>
+              <w:top w:val="single" w:sz="4" w:space="0" w:color="auto"/>
+              <w:left w:val="single" w:sz="8" w:space="0" w:color="auto"/>
+              <w:bottom w:val="single" w:sz="4" w:space="0" w:color="auto"/>
+              <w:right w:val="single" w:sz="8" w:space="0" w:color="auto"/>
+            </w:tcBorders>
+            <w:shd w:val="clear" w:color="auto" w:fill="auto"/>
+            <w:noWrap/>
+            <w:vAlign w:val="center"/>
+          </w:tcPr>
+          <w:p>
+            <w:pPr>
+              <w:spacing w:line="276" w:lineRule="auto"/>
+              <w:jc w:val="center"/>
+              <w:rPr>
+                <w:rFonts w:ascii="Segoe UI" w:hAnsi="Segoe UI" w:cs="Segoe UI"/>
+                <w:sz w:val="16"/>
+                <w:szCs w:val="16"/>
+              </w:rPr>
+            </w:pPr>
+            <w:r>
+              <w:rPr>
+                <w:rFonts w:ascii="Segoe UI" w:hAnsi="Segoe UI" w:cs="Segoe UI"/>
+                <w:sz w:val="16"/>
+                <w:szCs w:val="16"/>
+              </w:rPr>
+              <w:t>2198</w:t>
+            </w:r>
+          </w:p>
+        </w:tc>
+        <w:tc>
+          <w:tcPr>
+            <w:tcW w:w="1555" w:type="dxa"/>
+            <w:gridSpan w:val="2"/>
+            <w:tcBorders>
+              <w:top w:val="single" w:sz="4" w:space="0" w:color="auto"/>
+              <w:left w:val="single" w:sz="8" w:space="0" w:color="auto"/>
+              <w:bottom w:val="single" w:sz="4" w:space="0" w:color="auto"/>
+              <w:right w:val="single" w:sz="8" w:space="0" w:color="auto"/>
+            </w:tcBorders>
+            <w:shd w:val="clear" w:color="auto" w:fill="auto"/>
+            <w:vAlign w:val="center"/>
+          </w:tcPr>
+          <w:p>
+            <w:pPr>
+              <w:spacing w:line="276" w:lineRule="auto"/>
+              <w:jc w:val="center"/>
+              <w:rPr>
+                <w:rFonts w:ascii="Segoe UI" w:hAnsi="Segoe UI" w:cs="Segoe UI"/>
+                <w:sz w:val="16"/>
+                <w:szCs w:val="16"/>
+              </w:rPr>
+            </w:pPr>
+            <w:r>
+              <w:rPr>
+                <w:rFonts w:ascii="Segoe UI" w:hAnsi="Segoe UI" w:cs="Segoe UI"/>
+                <w:sz w:val="16"/>
+                <w:szCs w:val="16"/>
+              </w:rPr>
+              <w:t>4.2</w:t>
+            </w:r>
+          </w:p>
+        </w:tc>
+        <w:tc>
+          <w:tcPr>
+            <w:tcW w:w="1845" w:type="dxa"/>
+            <w:tcBorders>
+              <w:top w:val="single" w:sz="4" w:space="0" w:color="auto"/>
+              <w:left w:val="single" w:sz="8" w:space="0" w:color="auto"/>
+              <w:bottom w:val="single" w:sz="4" w:space="0" w:color="auto"/>
+            </w:tcBorders>
+            <w:shd w:val="clear" w:color="auto" w:fill="auto"/>
+            <w:noWrap/>
+            <w:vAlign w:val="center"/>
+          </w:tcPr>
+          <w:p>
+            <w:pPr>
+              <w:spacing w:line="276" w:lineRule="auto"/>
+              <w:jc w:val="center"/>
+              <w:rPr>
+                <w:rFonts w:ascii="Segoe UI" w:hAnsi="Segoe UI" w:cs="Segoe UI"/>
+                <w:sz w:val="16"/>
+                <w:szCs w:val="16"/>
+              </w:rPr>
+            </w:pPr>
+            <w:r>
+              <w:rPr>
+                <w:rFonts w:ascii="Segoe UI" w:hAnsi="Segoe UI" w:cs="Segoe UI"/>
+                <w:sz w:val="16"/>
+                <w:szCs w:val="16"/>
+              </w:rPr>
+              <w:t>MEGFELELŐ</w:t>
+            </w:r>
+          </w:p>
+        </w:tc>
+      </w:tr>
+      <w:tr>
+        <w:trPr>
+          <w:trHeight w:val="283"/>
+          <w:jc w:val="center"/>
+        </w:trPr>
+        <w:tc>
+          <w:tcPr>
+            <w:tcW w:w="3116" w:type="dxa"/>
+            <w:gridSpan w:val="4"/>
+            <w:tcBorders>
+              <w:top w:val="single" w:sz="4" w:space="0" w:color="auto"/>
+              <w:bottom w:val="single" w:sz="4" w:space="0" w:color="auto"/>
+              <w:right w:val="single" w:sz="8" w:space="0" w:color="auto"/>
+            </w:tcBorders>
+            <w:shd w:val="clear" w:color="auto" w:fill="auto"/>
+            <w:noWrap/>
+            <w:vAlign w:val="center"/>
+          </w:tcPr>
+          <w:p>
+            <w:pPr>
+              <w:spacing w:line="276" w:lineRule="auto"/>
+              <w:ind w:left="770"/>
+              <w:rPr>
+                <w:rFonts w:ascii="Segoe UI" w:hAnsi="Segoe UI" w:cs="Segoe UI"/>
+                <w:sz w:val="16"/>
+                <w:szCs w:val="16"/>
+              </w:rPr>
+            </w:pPr>
+            <w:r>
+              <w:rPr>
+                <w:rFonts w:ascii="Segoe UI" w:hAnsi="Segoe UI" w:cs="Segoe UI"/>
+                <w:sz w:val="16"/>
+                <w:szCs w:val="16"/>
+              </w:rPr>
+              <w:t>W22</w:t>
+            </w:r>
+          </w:p>
+        </w:tc>
+        <w:tc>
+          <w:tcPr>
+            <w:tcW w:w="1561" w:type="dxa"/>
+            <w:gridSpan w:val="2"/>
+            <w:tcBorders>
+              <w:top w:val="single" w:sz="4" w:space="0" w:color="auto"/>
+              <w:left w:val="single" w:sz="8" w:space="0" w:color="auto"/>
+              <w:bottom w:val="single" w:sz="4" w:space="0" w:color="auto"/>
+              <w:right w:val="single" w:sz="8" w:space="0" w:color="auto"/>
+            </w:tcBorders>
+            <w:shd w:val="clear" w:color="auto" w:fill="auto"/>
+            <w:noWrap/>
+            <w:vAlign w:val="center"/>
+          </w:tcPr>
+          <w:p>
+            <w:pPr>
+              <w:spacing w:line="276" w:lineRule="auto"/>
+              <w:jc w:val="center"/>
+              <w:rPr>
+                <w:rFonts w:ascii="Segoe UI" w:hAnsi="Segoe UI" w:cs="Segoe UI"/>
+                <w:sz w:val="16"/>
+                <w:szCs w:val="16"/>
+              </w:rPr>
+            </w:pPr>
+            <w:r>
+              <w:rPr>
+                <w:rFonts w:ascii="Segoe UI" w:hAnsi="Segoe UI" w:cs="Segoe UI"/>
+                <w:sz w:val="16"/>
+                <w:szCs w:val="16"/>
+              </w:rPr>
+              <w:t>110.5</w:t>
+            </w:r>
+          </w:p>
+        </w:tc>
+        <w:tc>
+          <w:tcPr>
+            <w:tcW w:w="1704" w:type="dxa"/>
+            <w:gridSpan w:val="3"/>
+            <w:tcBorders>
+              <w:top w:val="single" w:sz="4" w:space="0" w:color="auto"/>
+              <w:left w:val="single" w:sz="8" w:space="0" w:color="auto"/>
+              <w:bottom w:val="single" w:sz="4" w:space="0" w:color="auto"/>
+              <w:right w:val="single" w:sz="8" w:space="0" w:color="auto"/>
+            </w:tcBorders>
+            <w:shd w:val="clear" w:color="auto" w:fill="auto"/>
+            <w:noWrap/>
+            <w:vAlign w:val="center"/>
+          </w:tcPr>
+          <w:p>
+            <w:pPr>
+              <w:spacing w:line="276" w:lineRule="auto"/>
+              <w:jc w:val="center"/>
+              <w:rPr>
+                <w:rFonts w:ascii="Segoe UI" w:hAnsi="Segoe UI" w:cs="Segoe UI"/>
+                <w:sz w:val="16"/>
+                <w:szCs w:val="16"/>
+              </w:rPr>
+            </w:pPr>
+            <w:r>
+              <w:rPr>
+                <w:rFonts w:ascii="Segoe UI" w:hAnsi="Segoe UI" w:cs="Segoe UI"/>
+                <w:sz w:val="16"/>
+                <w:szCs w:val="16"/>
+              </w:rPr>
+              <w:t>2210</w:t>
+            </w:r>
+          </w:p>
+        </w:tc>
+        <w:tc>
+          <w:tcPr>
+            <w:tcW w:w="1555" w:type="dxa"/>
+            <w:gridSpan w:val="2"/>
+            <w:tcBorders>
+              <w:top w:val="single" w:sz="4" w:space="0" w:color="auto"/>
+              <w:left w:val="single" w:sz="8" w:space="0" w:color="auto"/>
+              <w:bottom w:val="single" w:sz="4" w:space="0" w:color="auto"/>
+              <w:right w:val="single" w:sz="8" w:space="0" w:color="auto"/>
+            </w:tcBorders>
+            <w:shd w:val="clear" w:color="auto" w:fill="auto"/>
+            <w:vAlign w:val="center"/>
+          </w:tcPr>
+          <w:p>
+            <w:pPr>
+              <w:spacing w:line="276" w:lineRule="auto"/>
+              <w:jc w:val="center"/>
+              <w:rPr>
+                <w:rFonts w:ascii="Segoe UI" w:hAnsi="Segoe UI" w:cs="Segoe UI"/>
+                <w:sz w:val="16"/>
+                <w:szCs w:val="16"/>
+              </w:rPr>
+            </w:pPr>
+            <w:r>
+              <w:rPr>
+                <w:rFonts w:ascii="Segoe UI" w:hAnsi="Segoe UI" w:cs="Segoe UI"/>
+                <w:sz w:val="16"/>
+                <w:szCs w:val="16"/>
+              </w:rPr>
+              <w:t>4.2</w:t>
+            </w:r>
+          </w:p>
+        </w:tc>
+        <w:tc>
+          <w:tcPr>
+            <w:tcW w:w="1845" w:type="dxa"/>
+            <w:tcBorders>
+              <w:top w:val="single" w:sz="4" w:space="0" w:color="auto"/>
+              <w:left w:val="single" w:sz="8" w:space="0" w:color="auto"/>
+              <w:bottom w:val="single" w:sz="4" w:space="0" w:color="auto"/>
+            </w:tcBorders>
+            <w:shd w:val="clear" w:color="auto" w:fill="auto"/>
+            <w:noWrap/>
+            <w:vAlign w:val="center"/>
+          </w:tcPr>
+          <w:p>
+            <w:pPr>
+              <w:spacing w:line="276" w:lineRule="auto"/>
+              <w:jc w:val="center"/>
+              <w:rPr>
+                <w:rFonts w:ascii="Segoe UI" w:hAnsi="Segoe UI" w:cs="Segoe UI"/>
+                <w:sz w:val="16"/>
+                <w:szCs w:val="16"/>
+              </w:rPr>
+            </w:pPr>
+            <w:r>
+              <w:rPr>
+                <w:rFonts w:ascii="Segoe UI" w:hAnsi="Segoe UI" w:cs="Segoe UI"/>
+                <w:sz w:val="16"/>
+                <w:szCs w:val="16"/>
+              </w:rPr>
+              <w:t>MEGFELELŐ</w:t>
+            </w:r>
+          </w:p>
+        </w:tc>
+      </w:tr>
+      <w:tr>
+        <w:trPr>
+          <w:trHeight w:val="283"/>
+          <w:jc w:val="center"/>
+        </w:trPr>
+        <w:tc>
+          <w:tcPr>
+            <w:tcW w:w="3116" w:type="dxa"/>
+            <w:gridSpan w:val="4"/>
+            <w:tcBorders>
+              <w:top w:val="single" w:sz="4" w:space="0" w:color="auto"/>
+              <w:bottom w:val="single" w:sz="4" w:space="0" w:color="auto"/>
+              <w:right w:val="single" w:sz="8" w:space="0" w:color="auto"/>
+            </w:tcBorders>
+            <w:shd w:val="clear" w:color="auto" w:fill="auto"/>
+            <w:noWrap/>
+            <w:vAlign w:val="center"/>
+          </w:tcPr>
+          <w:p>
+            <w:pPr>
+              <w:spacing w:line="276" w:lineRule="auto"/>
+              <w:ind w:left="770"/>
+              <w:rPr>
+                <w:rFonts w:ascii="Segoe UI" w:hAnsi="Segoe UI" w:cs="Segoe UI"/>
+                <w:sz w:val="16"/>
+                <w:szCs w:val="16"/>
+              </w:rPr>
+            </w:pPr>
+            <w:r>
+              <w:rPr>
+                <w:rFonts w:ascii="Segoe UI" w:hAnsi="Segoe UI" w:cs="Segoe UI"/>
+                <w:sz w:val="16"/>
+                <w:szCs w:val="16"/>
+              </w:rPr>
+              <w:t>W23</w:t>
+            </w:r>
+          </w:p>
+        </w:tc>
+        <w:tc>
+          <w:tcPr>
+            <w:tcW w:w="1561" w:type="dxa"/>
+            <w:gridSpan w:val="2"/>
+            <w:tcBorders>
+              <w:top w:val="single" w:sz="4" w:space="0" w:color="auto"/>
+              <w:left w:val="single" w:sz="8" w:space="0" w:color="auto"/>
+              <w:bottom w:val="single" w:sz="4" w:space="0" w:color="auto"/>
+              <w:right w:val="single" w:sz="8" w:space="0" w:color="auto"/>
+            </w:tcBorders>
+            <w:shd w:val="clear" w:color="auto" w:fill="auto"/>
+            <w:noWrap/>
+            <w:vAlign w:val="center"/>
+          </w:tcPr>
+          <w:p>
+            <w:pPr>
+              <w:spacing w:line="276" w:lineRule="auto"/>
+              <w:jc w:val="center"/>
+              <w:rPr>
+                <w:rFonts w:ascii="Segoe UI" w:hAnsi="Segoe UI" w:cs="Segoe UI"/>
+                <w:sz w:val="16"/>
+                <w:szCs w:val="16"/>
+              </w:rPr>
+            </w:pPr>
+            <w:r>
+              <w:rPr>
+                <w:rFonts w:ascii="Segoe UI" w:hAnsi="Segoe UI" w:cs="Segoe UI"/>
+                <w:sz w:val="16"/>
+                <w:szCs w:val="16"/>
+              </w:rPr>
+              <w:t>110</w:t>
+            </w:r>
+          </w:p>
+        </w:tc>
+        <w:tc>
+          <w:tcPr>
+            <w:tcW w:w="1704" w:type="dxa"/>
+            <w:gridSpan w:val="3"/>
+            <w:tcBorders>
+              <w:top w:val="single" w:sz="4" w:space="0" w:color="auto"/>
+              <w:left w:val="single" w:sz="8" w:space="0" w:color="auto"/>
+              <w:bottom w:val="single" w:sz="4" w:space="0" w:color="auto"/>
+              <w:right w:val="single" w:sz="8" w:space="0" w:color="auto"/>
+            </w:tcBorders>
+            <w:shd w:val="clear" w:color="auto" w:fill="auto"/>
+            <w:noWrap/>
+            <w:vAlign w:val="center"/>
+          </w:tcPr>
+          <w:p>
+            <w:pPr>
+              <w:spacing w:line="276" w:lineRule="auto"/>
+              <w:jc w:val="center"/>
+              <w:rPr>
+                <w:rFonts w:ascii="Segoe UI" w:hAnsi="Segoe UI" w:cs="Segoe UI"/>
+                <w:sz w:val="16"/>
+                <w:szCs w:val="16"/>
+              </w:rPr>
+            </w:pPr>
+            <w:r>
+              <w:rPr>
+                <w:rFonts w:ascii="Segoe UI" w:hAnsi="Segoe UI" w:cs="Segoe UI"/>
+                <w:sz w:val="16"/>
+                <w:szCs w:val="16"/>
+              </w:rPr>
+              <w:t>2200</w:t>
+            </w:r>
+          </w:p>
+        </w:tc>
+        <w:tc>
+          <w:tcPr>
+            <w:tcW w:w="1555" w:type="dxa"/>
+            <w:gridSpan w:val="2"/>
+            <w:tcBorders>
+              <w:top w:val="single" w:sz="4" w:space="0" w:color="auto"/>
+              <w:left w:val="single" w:sz="8" w:space="0" w:color="auto"/>
+              <w:bottom w:val="single" w:sz="4" w:space="0" w:color="auto"/>
+              <w:right w:val="single" w:sz="8" w:space="0" w:color="auto"/>
+            </w:tcBorders>
+            <w:shd w:val="clear" w:color="auto" w:fill="auto"/>
+            <w:vAlign w:val="center"/>
+          </w:tcPr>
+          <w:p>
+            <w:pPr>
+              <w:spacing w:line="276" w:lineRule="auto"/>
+              <w:jc w:val="center"/>
+              <w:rPr>
+                <w:rFonts w:ascii="Segoe UI" w:hAnsi="Segoe UI" w:cs="Segoe UI"/>
+                <w:sz w:val="16"/>
+                <w:szCs w:val="16"/>
+              </w:rPr>
+            </w:pPr>
+            <w:r>
+              <w:rPr>
+                <w:rFonts w:ascii="Segoe UI" w:hAnsi="Segoe UI" w:cs="Segoe UI"/>
+                <w:sz w:val="16"/>
+                <w:szCs w:val="16"/>
+              </w:rPr>
+              <w:t>4.2</w:t>
+            </w:r>
+          </w:p>
+        </w:tc>
+        <w:tc>
+          <w:tcPr>
+            <w:tcW w:w="1845" w:type="dxa"/>
+            <w:tcBorders>
+              <w:top w:val="single" w:sz="4" w:space="0" w:color="auto"/>
+              <w:left w:val="single" w:sz="8" w:space="0" w:color="auto"/>
+              <w:bottom w:val="single" w:sz="4" w:space="0" w:color="auto"/>
+            </w:tcBorders>
+            <w:shd w:val="clear" w:color="auto" w:fill="auto"/>
+            <w:noWrap/>
+            <w:vAlign w:val="center"/>
+          </w:tcPr>
+          <w:p>
+            <w:pPr>
+              <w:spacing w:line="276" w:lineRule="auto"/>
+              <w:jc w:val="center"/>
+              <w:rPr>
+                <w:rFonts w:ascii="Segoe UI" w:hAnsi="Segoe UI" w:cs="Segoe UI"/>
+                <w:sz w:val="16"/>
+                <w:szCs w:val="16"/>
+              </w:rPr>
+            </w:pPr>
+            <w:r>
+              <w:rPr>
+                <w:rFonts w:ascii="Segoe UI" w:hAnsi="Segoe UI" w:cs="Segoe UI"/>
+                <w:sz w:val="16"/>
+                <w:szCs w:val="16"/>
+              </w:rPr>
+              <w:t>MEGFELELŐ</w:t>
+            </w:r>
+          </w:p>
+        </w:tc>
+      </w:tr>
+      <w:tr>
+        <w:trPr>
+          <w:trHeight w:val="283"/>
+          <w:jc w:val="center"/>
+        </w:trPr>
+        <w:tc>
+          <w:tcPr>
+            <w:tcW w:w="3116" w:type="dxa"/>
+            <w:gridSpan w:val="4"/>
+            <w:tcBorders>
+              <w:top w:val="single" w:sz="4" w:space="0" w:color="auto"/>
+              <w:bottom w:val="single" w:sz="4" w:space="0" w:color="auto"/>
+              <w:right w:val="single" w:sz="8" w:space="0" w:color="auto"/>
+            </w:tcBorders>
+            <w:shd w:val="clear" w:color="auto" w:fill="auto"/>
+            <w:noWrap/>
+            <w:vAlign w:val="center"/>
+          </w:tcPr>
+          <w:p>
+            <w:pPr>
+              <w:spacing w:line="276" w:lineRule="auto"/>
+              <w:ind w:left="770"/>
+              <w:rPr>
+                <w:rFonts w:ascii="Segoe UI" w:hAnsi="Segoe UI" w:cs="Segoe UI"/>
+                <w:sz w:val="16"/>
+                <w:szCs w:val="16"/>
+              </w:rPr>
+            </w:pPr>
+            <w:r>
+              <w:rPr>
+                <w:rFonts w:ascii="Segoe UI" w:hAnsi="Segoe UI" w:cs="Segoe UI"/>
+                <w:sz w:val="16"/>
+                <w:szCs w:val="16"/>
+              </w:rPr>
+              <w:t>W24</w:t>
+            </w:r>
+          </w:p>
+        </w:tc>
+        <w:tc>
+          <w:tcPr>
+            <w:tcW w:w="1561" w:type="dxa"/>
+            <w:gridSpan w:val="2"/>
+            <w:tcBorders>
+              <w:top w:val="single" w:sz="4" w:space="0" w:color="auto"/>
+              <w:left w:val="single" w:sz="8" w:space="0" w:color="auto"/>
+              <w:bottom w:val="single" w:sz="4" w:space="0" w:color="auto"/>
+              <w:right w:val="single" w:sz="8" w:space="0" w:color="auto"/>
+            </w:tcBorders>
+            <w:shd w:val="clear" w:color="auto" w:fill="auto"/>
+            <w:noWrap/>
+            <w:vAlign w:val="center"/>
+          </w:tcPr>
+          <w:p>
+            <w:pPr>
+              <w:spacing w:line="276" w:lineRule="auto"/>
+              <w:jc w:val="center"/>
+              <w:rPr>
+                <w:rFonts w:ascii="Segoe UI" w:hAnsi="Segoe UI" w:cs="Segoe UI"/>
+                <w:sz w:val="16"/>
+                <w:szCs w:val="16"/>
+              </w:rPr>
+            </w:pPr>
+            <w:r>
+              <w:rPr>
+                <w:rFonts w:ascii="Segoe UI" w:hAnsi="Segoe UI" w:cs="Segoe UI"/>
+                <w:sz w:val="16"/>
+                <w:szCs w:val="16"/>
+              </w:rPr>
+              <w:t>109</w:t>
+            </w:r>
+          </w:p>
+        </w:tc>
+        <w:tc>
+          <w:tcPr>
+            <w:tcW w:w="1704" w:type="dxa"/>
+            <w:gridSpan w:val="3"/>
+            <w:tcBorders>
+              <w:top w:val="single" w:sz="4" w:space="0" w:color="auto"/>
+              <w:left w:val="single" w:sz="8" w:space="0" w:color="auto"/>
+              <w:bottom w:val="single" w:sz="4" w:space="0" w:color="auto"/>
+              <w:right w:val="single" w:sz="8" w:space="0" w:color="auto"/>
+            </w:tcBorders>
+            <w:shd w:val="clear" w:color="auto" w:fill="auto"/>
+            <w:noWrap/>
+            <w:vAlign w:val="center"/>
+          </w:tcPr>
+          <w:p>
+            <w:pPr>
+              <w:spacing w:line="276" w:lineRule="auto"/>
+              <w:jc w:val="center"/>
+              <w:rPr>
+                <w:rFonts w:ascii="Segoe UI" w:hAnsi="Segoe UI" w:cs="Segoe UI"/>
+                <w:sz w:val="16"/>
+                <w:szCs w:val="16"/>
+              </w:rPr>
+            </w:pPr>
+            <w:r>
+              <w:rPr>
+                <w:rFonts w:ascii="Segoe UI" w:hAnsi="Segoe UI" w:cs="Segoe UI"/>
+                <w:sz w:val="16"/>
+                <w:szCs w:val="16"/>
+              </w:rPr>
+              <w:t>2180</w:t>
+            </w:r>
+          </w:p>
+        </w:tc>
+        <w:tc>
+          <w:tcPr>
+            <w:tcW w:w="1555" w:type="dxa"/>
+            <w:gridSpan w:val="2"/>
+            <w:tcBorders>
+              <w:top w:val="single" w:sz="4" w:space="0" w:color="auto"/>
+              <w:left w:val="single" w:sz="8" w:space="0" w:color="auto"/>
+              <w:bottom w:val="single" w:sz="4" w:space="0" w:color="auto"/>
+              <w:right w:val="single" w:sz="8" w:space="0" w:color="auto"/>
+            </w:tcBorders>
+            <w:shd w:val="clear" w:color="auto" w:fill="auto"/>
+            <w:vAlign w:val="center"/>
+          </w:tcPr>
+          <w:p>
+            <w:pPr>
+              <w:spacing w:line="276" w:lineRule="auto"/>
+              <w:jc w:val="center"/>
+              <w:rPr>
+                <w:rFonts w:ascii="Segoe UI" w:hAnsi="Segoe UI" w:cs="Segoe UI"/>
+                <w:sz w:val="16"/>
+                <w:szCs w:val="16"/>
+              </w:rPr>
+            </w:pPr>
+            <w:r>
+              <w:rPr>
+                <w:rFonts w:ascii="Segoe UI" w:hAnsi="Segoe UI" w:cs="Segoe UI"/>
+                <w:sz w:val="16"/>
+                <w:szCs w:val="16"/>
+              </w:rPr>
+              <w:t>4.2</w:t>
+            </w:r>
+          </w:p>
+        </w:tc>
+        <w:tc>
+          <w:tcPr>
+            <w:tcW w:w="1845" w:type="dxa"/>
+            <w:tcBorders>
+              <w:top w:val="single" w:sz="4" w:space="0" w:color="auto"/>
+              <w:left w:val="single" w:sz="8" w:space="0" w:color="auto"/>
+              <w:bottom w:val="single" w:sz="4" w:space="0" w:color="auto"/>
+            </w:tcBorders>
+            <w:shd w:val="clear" w:color="auto" w:fill="auto"/>
+            <w:noWrap/>
+            <w:vAlign w:val="center"/>
+          </w:tcPr>
+          <w:p>
+            <w:pPr>
+              <w:spacing w:line="276" w:lineRule="auto"/>
+              <w:jc w:val="center"/>
+              <w:rPr>
+                <w:rFonts w:ascii="Segoe UI" w:hAnsi="Segoe UI" w:cs="Segoe UI"/>
+                <w:sz w:val="16"/>
+                <w:szCs w:val="16"/>
+              </w:rPr>
+            </w:pPr>
+            <w:r>
+              <w:rPr>
+                <w:rFonts w:ascii="Segoe UI" w:hAnsi="Segoe UI" w:cs="Segoe UI"/>
+                <w:sz w:val="16"/>
+                <w:szCs w:val="16"/>
+              </w:rPr>
+              <w:t>MEGFELELŐ</w:t>
+            </w:r>
+          </w:p>
+        </w:tc>
+      </w:tr>
+      <w:tr>
+        <w:trPr>
+          <w:trHeight w:val="283"/>
+          <w:jc w:val="center"/>
+        </w:trPr>
+        <w:tc>
+          <w:tcPr>
+            <w:tcW w:w="3116" w:type="dxa"/>
+            <w:gridSpan w:val="4"/>
+            <w:tcBorders>
+              <w:top w:val="single" w:sz="4" w:space="0" w:color="auto"/>
+              <w:bottom w:val="single" w:sz="4" w:space="0" w:color="auto"/>
+              <w:right w:val="single" w:sz="8" w:space="0" w:color="auto"/>
+            </w:tcBorders>
+            <w:shd w:val="clear" w:color="auto" w:fill="auto"/>
+            <w:noWrap/>
+            <w:vAlign w:val="center"/>
+          </w:tcPr>
+          <w:p>
+            <w:pPr>
+              <w:spacing w:line="276" w:lineRule="auto"/>
+              <w:ind w:left="770"/>
+              <w:rPr>
+                <w:rFonts w:ascii="Segoe UI" w:hAnsi="Segoe UI" w:cs="Segoe UI"/>
+                <w:sz w:val="16"/>
+                <w:szCs w:val="16"/>
+              </w:rPr>
+            </w:pPr>
+            <w:r>
+              <w:rPr>
+                <w:rFonts w:ascii="Segoe UI" w:hAnsi="Segoe UI" w:cs="Segoe UI"/>
+                <w:sz w:val="16"/>
+                <w:szCs w:val="16"/>
+              </w:rPr>
+              <w:t>W25</w:t>
+            </w:r>
+          </w:p>
+        </w:tc>
+        <w:tc>
+          <w:tcPr>
+            <w:tcW w:w="1561" w:type="dxa"/>
+            <w:gridSpan w:val="2"/>
+            <w:tcBorders>
+              <w:top w:val="single" w:sz="4" w:space="0" w:color="auto"/>
+              <w:left w:val="single" w:sz="8" w:space="0" w:color="auto"/>
+              <w:bottom w:val="single" w:sz="4" w:space="0" w:color="auto"/>
+              <w:right w:val="single" w:sz="8" w:space="0" w:color="auto"/>
+            </w:tcBorders>
+            <w:shd w:val="clear" w:color="auto" w:fill="auto"/>
+            <w:noWrap/>
+            <w:vAlign w:val="center"/>
+          </w:tcPr>
+          <w:p>
+            <w:pPr>
+              <w:spacing w:line="276" w:lineRule="auto"/>
+              <w:jc w:val="center"/>
+              <w:rPr>
+                <w:rFonts w:ascii="Segoe UI" w:hAnsi="Segoe UI" w:cs="Segoe UI"/>
+                <w:sz w:val="16"/>
+                <w:szCs w:val="16"/>
+              </w:rPr>
+            </w:pPr>
+            <w:r>
+              <w:rPr>
+                <w:rFonts w:ascii="Segoe UI" w:hAnsi="Segoe UI" w:cs="Segoe UI"/>
+                <w:sz w:val="16"/>
+                <w:szCs w:val="16"/>
+              </w:rPr>
+              <w:t>109.25</w:t>
+            </w:r>
+          </w:p>
+        </w:tc>
+        <w:tc>
+          <w:tcPr>
+            <w:tcW w:w="1704" w:type="dxa"/>
+            <w:gridSpan w:val="3"/>
+            <w:tcBorders>
+              <w:top w:val="single" w:sz="4" w:space="0" w:color="auto"/>
+              <w:left w:val="single" w:sz="8" w:space="0" w:color="auto"/>
+              <w:bottom w:val="single" w:sz="4" w:space="0" w:color="auto"/>
+              <w:right w:val="single" w:sz="8" w:space="0" w:color="auto"/>
+            </w:tcBorders>
+            <w:shd w:val="clear" w:color="auto" w:fill="auto"/>
+            <w:noWrap/>
+            <w:vAlign w:val="center"/>
+          </w:tcPr>
+          <w:p>
+            <w:pPr>
+              <w:spacing w:line="276" w:lineRule="auto"/>
+              <w:jc w:val="center"/>
+              <w:rPr>
+                <w:rFonts w:ascii="Segoe UI" w:hAnsi="Segoe UI" w:cs="Segoe UI"/>
+                <w:sz w:val="16"/>
+                <w:szCs w:val="16"/>
+              </w:rPr>
+            </w:pPr>
+            <w:r>
+              <w:rPr>
+                <w:rFonts w:ascii="Segoe UI" w:hAnsi="Segoe UI" w:cs="Segoe UI"/>
+                <w:sz w:val="16"/>
+                <w:szCs w:val="16"/>
+              </w:rPr>
+              <w:t>2185</w:t>
+            </w:r>
+          </w:p>
+        </w:tc>
+        <w:tc>
+          <w:tcPr>
+            <w:tcW w:w="1555" w:type="dxa"/>
+            <w:gridSpan w:val="2"/>
+            <w:tcBorders>
+              <w:top w:val="single" w:sz="4" w:space="0" w:color="auto"/>
+              <w:left w:val="single" w:sz="8" w:space="0" w:color="auto"/>
+              <w:bottom w:val="single" w:sz="4" w:space="0" w:color="auto"/>
+              <w:right w:val="single" w:sz="8" w:space="0" w:color="auto"/>
+            </w:tcBorders>
+            <w:shd w:val="clear" w:color="auto" w:fill="auto"/>
+            <w:vAlign w:val="center"/>
+          </w:tcPr>
+          <w:p>
+            <w:pPr>
+              <w:spacing w:line="276" w:lineRule="auto"/>
+              <w:jc w:val="center"/>
+              <w:rPr>
+                <w:rFonts w:ascii="Segoe UI" w:hAnsi="Segoe UI" w:cs="Segoe UI"/>
+                <w:sz w:val="16"/>
+                <w:szCs w:val="16"/>
+              </w:rPr>
+            </w:pPr>
+            <w:r>
+              <w:rPr>
+                <w:rFonts w:ascii="Segoe UI" w:hAnsi="Segoe UI" w:cs="Segoe UI"/>
+                <w:sz w:val="16"/>
+                <w:szCs w:val="16"/>
+              </w:rPr>
+              <w:t>4.2</w:t>
+            </w:r>
+          </w:p>
+        </w:tc>
+        <w:tc>
+          <w:tcPr>
+            <w:tcW w:w="1845" w:type="dxa"/>
+            <w:tcBorders>
+              <w:top w:val="single" w:sz="4" w:space="0" w:color="auto"/>
+              <w:left w:val="single" w:sz="8" w:space="0" w:color="auto"/>
+              <w:bottom w:val="single" w:sz="4" w:space="0" w:color="auto"/>
+            </w:tcBorders>
+            <w:shd w:val="clear" w:color="auto" w:fill="auto"/>
+            <w:noWrap/>
+            <w:vAlign w:val="center"/>
+          </w:tcPr>
+          <w:p>
+            <w:pPr>
+              <w:spacing w:line="276" w:lineRule="auto"/>
+              <w:jc w:val="center"/>
+              <w:rPr>
+                <w:rFonts w:ascii="Segoe UI" w:hAnsi="Segoe UI" w:cs="Segoe UI"/>
+                <w:sz w:val="16"/>
+                <w:szCs w:val="16"/>
+              </w:rPr>
+            </w:pPr>
+            <w:r>
+              <w:rPr>
+                <w:rFonts w:ascii="Segoe UI" w:hAnsi="Segoe UI" w:cs="Segoe UI"/>
+                <w:sz w:val="16"/>
+                <w:szCs w:val="16"/>
+              </w:rPr>
+              <w:t>MEGFELELŐ</w:t>
+            </w:r>
+          </w:p>
+        </w:tc>
+      </w:tr>
+      <w:tr>
+        <w:trPr>
+          <w:trHeight w:val="283"/>
+          <w:jc w:val="center"/>
+        </w:trPr>
+        <w:tc>
+          <w:tcPr>
+            <w:tcW w:w="3116" w:type="dxa"/>
+            <w:gridSpan w:val="4"/>
+            <w:tcBorders>
+              <w:top w:val="single" w:sz="4" w:space="0" w:color="auto"/>
+              <w:bottom w:val="single" w:sz="4" w:space="0" w:color="auto"/>
+              <w:right w:val="single" w:sz="8" w:space="0" w:color="auto"/>
+            </w:tcBorders>
+            <w:shd w:val="clear" w:color="auto" w:fill="auto"/>
+            <w:noWrap/>
+            <w:vAlign w:val="center"/>
+          </w:tcPr>
+          <w:p>
+            <w:pPr>
+              <w:spacing w:line="276" w:lineRule="auto"/>
+              <w:ind w:left="770"/>
+              <w:rPr>
+                <w:rFonts w:ascii="Segoe UI" w:hAnsi="Segoe UI" w:cs="Segoe UI"/>
+                <w:sz w:val="16"/>
+                <w:szCs w:val="16"/>
+              </w:rPr>
+            </w:pPr>
+            <w:r>
+              <w:rPr>
+                <w:rFonts w:ascii="Segoe UI" w:hAnsi="Segoe UI" w:cs="Segoe UI"/>
+                <w:sz w:val="16"/>
+                <w:szCs w:val="16"/>
+              </w:rPr>
+              <w:t>W26</w:t>
+            </w:r>
+          </w:p>
+        </w:tc>
+        <w:tc>
+          <w:tcPr>
+            <w:tcW w:w="1561" w:type="dxa"/>
+            <w:gridSpan w:val="2"/>
+            <w:tcBorders>
+              <w:top w:val="single" w:sz="4" w:space="0" w:color="auto"/>
+              <w:left w:val="single" w:sz="8" w:space="0" w:color="auto"/>
+              <w:bottom w:val="single" w:sz="4" w:space="0" w:color="auto"/>
+              <w:right w:val="single" w:sz="8" w:space="0" w:color="auto"/>
+            </w:tcBorders>
+            <w:shd w:val="clear" w:color="auto" w:fill="auto"/>
+            <w:noWrap/>
+            <w:vAlign w:val="center"/>
+          </w:tcPr>
+          <w:p>
+            <w:pPr>
+              <w:spacing w:line="276" w:lineRule="auto"/>
+              <w:jc w:val="center"/>
+              <w:rPr>
+                <w:rFonts w:ascii="Segoe UI" w:hAnsi="Segoe UI" w:cs="Segoe UI"/>
+                <w:sz w:val="16"/>
+                <w:szCs w:val="16"/>
+              </w:rPr>
+            </w:pPr>
+            <w:r>
+              <w:rPr>
+                <w:rFonts w:ascii="Segoe UI" w:hAnsi="Segoe UI" w:cs="Segoe UI"/>
+                <w:sz w:val="16"/>
+                <w:szCs w:val="16"/>
+              </w:rPr>
+              <w:t>110</w:t>
+            </w:r>
+          </w:p>
+        </w:tc>
+        <w:tc>
+          <w:tcPr>
+            <w:tcW w:w="1704" w:type="dxa"/>
+            <w:gridSpan w:val="3"/>
+            <w:tcBorders>
+              <w:top w:val="single" w:sz="4" w:space="0" w:color="auto"/>
+              <w:left w:val="single" w:sz="8" w:space="0" w:color="auto"/>
+              <w:bottom w:val="single" w:sz="4" w:space="0" w:color="auto"/>
+              <w:right w:val="single" w:sz="8" w:space="0" w:color="auto"/>
+            </w:tcBorders>
+            <w:shd w:val="clear" w:color="auto" w:fill="auto"/>
+            <w:noWrap/>
+            <w:vAlign w:val="center"/>
+          </w:tcPr>
+          <w:p>
+            <w:pPr>
+              <w:spacing w:line="276" w:lineRule="auto"/>
+              <w:jc w:val="center"/>
+              <w:rPr>
+                <w:rFonts w:ascii="Segoe UI" w:hAnsi="Segoe UI" w:cs="Segoe UI"/>
+                <w:sz w:val="16"/>
+                <w:szCs w:val="16"/>
+              </w:rPr>
+            </w:pPr>
+            <w:r>
+              <w:rPr>
+                <w:rFonts w:ascii="Segoe UI" w:hAnsi="Segoe UI" w:cs="Segoe UI"/>
+                <w:sz w:val="16"/>
+                <w:szCs w:val="16"/>
+              </w:rPr>
+              <w:t>2200</w:t>
+            </w:r>
+          </w:p>
+        </w:tc>
+        <w:tc>
+          <w:tcPr>
+            <w:tcW w:w="1555" w:type="dxa"/>
+            <w:gridSpan w:val="2"/>
+            <w:tcBorders>
+              <w:top w:val="single" w:sz="4" w:space="0" w:color="auto"/>
+              <w:left w:val="single" w:sz="8" w:space="0" w:color="auto"/>
+              <w:bottom w:val="single" w:sz="4" w:space="0" w:color="auto"/>
+              <w:right w:val="single" w:sz="8" w:space="0" w:color="auto"/>
+            </w:tcBorders>
+            <w:shd w:val="clear" w:color="auto" w:fill="auto"/>
+            <w:vAlign w:val="center"/>
+          </w:tcPr>
+          <w:p>
+            <w:pPr>
+              <w:spacing w:line="276" w:lineRule="auto"/>
+              <w:jc w:val="center"/>
+              <w:rPr>
+                <w:rFonts w:ascii="Segoe UI" w:hAnsi="Segoe UI" w:cs="Segoe UI"/>
+                <w:sz w:val="16"/>
+                <w:szCs w:val="16"/>
+              </w:rPr>
+            </w:pPr>
+            <w:r>
+              <w:rPr>
+                <w:rFonts w:ascii="Segoe UI" w:hAnsi="Segoe UI" w:cs="Segoe UI"/>
+                <w:sz w:val="16"/>
+                <w:szCs w:val="16"/>
+              </w:rPr>
+              <w:t>4.2</w:t>
+            </w:r>
+          </w:p>
+        </w:tc>
+        <w:tc>
+          <w:tcPr>
+            <w:tcW w:w="1845" w:type="dxa"/>
+            <w:tcBorders>
+              <w:top w:val="single" w:sz="4" w:space="0" w:color="auto"/>
+              <w:left w:val="single" w:sz="8" w:space="0" w:color="auto"/>
+              <w:bottom w:val="single" w:sz="4" w:space="0" w:color="auto"/>
+            </w:tcBorders>
+            <w:shd w:val="clear" w:color="auto" w:fill="auto"/>
+            <w:noWrap/>
+            <w:vAlign w:val="center"/>
+          </w:tcPr>
+          <w:p>
+            <w:pPr>
+              <w:spacing w:line="276" w:lineRule="auto"/>
+              <w:jc w:val="center"/>
+              <w:rPr>
+                <w:rFonts w:ascii="Segoe UI" w:hAnsi="Segoe UI" w:cs="Segoe UI"/>
+                <w:sz w:val="16"/>
+                <w:szCs w:val="16"/>
+              </w:rPr>
+            </w:pPr>
+            <w:r>
+              <w:rPr>
+                <w:rFonts w:ascii="Segoe UI" w:hAnsi="Segoe UI" w:cs="Segoe UI"/>
+                <w:sz w:val="16"/>
+                <w:szCs w:val="16"/>
+              </w:rPr>
+              <w:t>MEGFELELŐ</w:t>
+            </w:r>
+          </w:p>
+        </w:tc>
+      </w:tr>
+      <w:tr>
+        <w:trPr>
+          <w:trHeight w:val="597"/>
+          <w:jc w:val="center"/>
+        </w:trPr>
+        <w:tc>
+          <w:tcPr>
+            <w:tcW w:w="3116" w:type="dxa"/>
+            <w:gridSpan w:val="4"/>
+            <w:tcBorders>
               <w:top w:val="single" w:sz="8" w:space="0" w:color="auto"/>
               <w:bottom w:val="single" w:sz="8" w:space="0" w:color="auto"/>
             </w:tcBorders>
@@ -2975,23 +4195,31 @@
                 <w:sz w:val="16"/>
                 <w:szCs w:val="16"/>
               </w:rPr>
-              <w:t xml:space="preserve"> Érd, 2025. május </w:t>
-            </w:r>
-            <w:r>
-              <w:rPr>
-                <w:rFonts w:ascii="Segoe UI" w:hAnsi="Segoe UI" w:cs="Segoe UI"/>
-                <w:sz w:val="16"/>
-                <w:szCs w:val="16"/>
-              </w:rPr>
-              <w:t>21</w:t>
-            </w:r>
-            <w:r>
-              <w:rPr>
-                <w:rFonts w:ascii="Segoe UI" w:hAnsi="Segoe UI" w:cs="Segoe UI"/>
-                <w:sz w:val="16"/>
-                <w:szCs w:val="16"/>
-              </w:rPr>
-              <w:t>.</w:t>
+              <w:t xml:space="preserve"> Érd, 202</w:t>
+            </w:r>
+            <w:r>
+              <w:rPr>
+                <w:rFonts w:ascii="Segoe UI" w:hAnsi="Segoe UI" w:cs="Segoe UI"/>
+                <w:sz w:val="16"/>
+                <w:szCs w:val="16"/>
+              </w:rPr>
+              <w:t>6</w:t>
+            </w:r>
+            <w:r>
+              <w:rPr>
+                <w:rFonts w:ascii="Segoe UI" w:hAnsi="Segoe UI" w:cs="Segoe UI"/>
+                <w:sz w:val="16"/>
+                <w:szCs w:val="16"/>
+              </w:rPr>
+              <w:t xml:space="preserve">. </w:t>
+            </w:r>
+            <w:r>
+              <w:rPr>
+                <w:rFonts w:ascii="Segoe UI" w:hAnsi="Segoe UI" w:cs="Segoe UI"/>
+                <w:sz w:val="16"/>
+                <w:szCs w:val="16"/>
+              </w:rPr>
+              <w:t>június 15.</w:t>
             </w:r>
           </w:p>
         </w:tc>
@@ -3016,14 +4244,6 @@
                 <w:szCs w:val="16"/>
               </w:rPr>
             </w:pPr>
-            <w:r>
-              <w:rPr>
-                <w:rFonts w:ascii="Segoe UI" w:hAnsi="Segoe UI" w:cs="Segoe UI"/>
-                <w:sz w:val="16"/>
-                <w:szCs w:val="16"/>
-              </w:rPr>
-              <w:t>P.H:</w:t>
-            </w:r>
           </w:p>
         </w:tc>
         <w:tc>
@@ -3066,8 +4286,76 @@
           <w:sz w:val="18"/>
         </w:rPr>
       </w:pPr>
-      <w:bookmarkStart w:id="1" w:name="_GoBack"/>
-      <w:bookmarkEnd w:id="1"/>
+      <w:r>
+        <w:rPr>
+          <w:rFonts w:ascii="Segoe UI" w:hAnsi="Segoe UI" w:cs="Segoe UI"/>
+          <w:noProof/>
+          <w:sz w:val="16"/>
+          <w:szCs w:val="16"/>
+        </w:rPr>
+        <w:drawing>
+          <wp:anchor distT="0" distB="0" distL="114300" distR="114300" simplePos="0" relativeHeight="251658240" behindDoc="1" locked="0" layoutInCell="1" allowOverlap="1" wp14:editId="75491C3E">
+            <wp:simplePos x="0" y="0"/>
+            <wp:positionH relativeFrom="column">
+              <wp:posOffset>4542155</wp:posOffset>
+            </wp:positionH>
+            <wp:positionV relativeFrom="paragraph">
+              <wp:posOffset>120650</wp:posOffset>
+            </wp:positionV>
+            <wp:extent cx="1314450" cy="476250"/>
+            <wp:effectExtent l="0" t="0" r="0" b="0"/>
+            <wp:wrapNone/>
+            <wp:docPr id="1" name="Kép 1" descr="bélyegző_körbevágott"/>
+            <wp:cNvGraphicFramePr>
+              <a:graphicFrameLocks xmlns:a="http://schemas.openxmlformats.org/drawingml/2006/main" noChangeAspect="1"/>
+            </wp:cNvGraphicFramePr>
+            <a:graphic xmlns:a="http://schemas.openxmlformats.org/drawingml/2006/main">
+              <a:graphicData uri="http://schemas.openxmlformats.org/drawingml/2006/picture">
+                <pic:pic xmlns:pic="http://schemas.openxmlformats.org/drawingml/2006/picture">
+                  <pic:nvPicPr>
+                    <pic:cNvPr id="0" name="Picture 2" descr="bélyegző_körbevágott"/>
+                    <pic:cNvPicPr>
+                      <a:picLocks noChangeAspect="1" noChangeArrowheads="1"/>
+                    </pic:cNvPicPr>
+                  </pic:nvPicPr>
+                  <pic:blipFill>
+                    <a:blip r:embed="rId7">
+                      <a:extLst>
+                        <a:ext uri="{28A0092B-C50C-407E-A947-70E740481C1C}">
+                          <a14:useLocalDpi xmlns:a14="http://schemas.microsoft.com/office/drawing/2010/main" val="0"/>
+                        </a:ext>
+                      </a:extLst>
+                    </a:blip>
+                    <a:srcRect/>
+                    <a:stretch>
+                      <a:fillRect/>
+                    </a:stretch>
+                  </pic:blipFill>
+                  <pic:spPr bwMode="auto">
+                    <a:xfrm>
+                      <a:off x="0" y="0"/>
+                      <a:ext cx="1314450" cy="476250"/>
+                    </a:xfrm>
+                    <a:prstGeom prst="rect">
+                      <a:avLst/>
+                    </a:prstGeom>
+                    <a:noFill/>
+                    <a:ln>
+                      <a:noFill/>
+                    </a:ln>
+                  </pic:spPr>
+                </pic:pic>
+              </a:graphicData>
+            </a:graphic>
+            <wp14:sizeRelH relativeFrom="page">
+              <wp14:pctWidth>0</wp14:pctWidth>
+            </wp14:sizeRelH>
+            <wp14:sizeRelV relativeFrom="page">
+              <wp14:pctHeight>0</wp14:pctHeight>
+            </wp14:sizeRelV>
+          </wp:anchor>
+        </w:drawing>
+      </w:r>
     </w:p>
     <w:sectPr>
       <w:pgSz w:w="11906" w:h="16838"/>
@@ -3806,7 +5094,7 @@
 </file>
 
 <file path=customXml/itemProps1.xml><?xml version="1.0" encoding="utf-8"?>
-<ds:datastoreItem xmlns:ds="http://schemas.openxmlformats.org/officeDocument/2006/customXml" ds:itemID="{20B98721-F7DB-4CED-A697-7B02BDD66BAE}">
+<ds:datastoreItem xmlns:ds="http://schemas.openxmlformats.org/officeDocument/2006/customXml" ds:itemID="{208A6E47-8051-44FB-BA41-7A7D459EC379}">
   <ds:schemaRefs>
     <ds:schemaRef ds:uri="http://schemas.openxmlformats.org/officeDocument/2006/bibliography"/>
   </ds:schemaRefs>

</xml_diff>